<commit_message>
Render updated resume as PDF
</commit_message>
<xml_diff>
--- a/assets/resume.docx
+++ b/assets/resume.docx
@@ -1,6 +1,6 @@
 
 <file path=word/document.xml><?xml version="1.0" encoding="utf-8"?>
-<w:document xmlns:wpc="http://schemas.microsoft.com/office/word/2010/wordprocessingCanvas" xmlns:cx="http://schemas.microsoft.com/office/drawing/2014/chartex" xmlns:cx1="http://schemas.microsoft.com/office/drawing/2015/9/8/chartex" xmlns:cx2="http://schemas.microsoft.com/office/drawing/2015/10/21/chartex" xmlns:cx3="http://schemas.microsoft.com/office/drawing/2016/5/9/chartex" xmlns:cx4="http://schemas.microsoft.com/office/drawing/2016/5/10/chartex" xmlns:cx5="http://schemas.microsoft.com/office/drawing/2016/5/11/chartex" xmlns:cx6="http://schemas.microsoft.com/office/drawing/2016/5/12/chartex" xmlns:cx7="http://schemas.microsoft.com/office/drawing/2016/5/13/chartex" xmlns:cx8="http://schemas.microsoft.com/office/drawing/2016/5/14/chartex" xmlns:mc="http://schemas.openxmlformats.org/markup-compatibility/2006" xmlns:aink="http://schemas.microsoft.com/office/drawing/2016/ink" xmlns:am3d="http://schemas.microsoft.com/office/drawing/2017/model3d" xmlns:o="urn:schemas-microsoft-com:office:office" xmlns:oel="http://schemas.microsoft.com/office/2019/extlst" xmlns:r="http://schemas.openxmlformats.org/officeDocument/2006/relationships" xmlns:m="http://schemas.openxmlformats.org/officeDocument/2006/math" xmlns:v="urn:schemas-microsoft-com:vml" xmlns:wp14="http://schemas.microsoft.com/office/word/2010/wordprocessingDrawing" xmlns:wp="http://schemas.openxmlformats.org/drawingml/2006/wordprocessingDrawing" xmlns:w10="urn:schemas-microsoft-com:office:word" xmlns:w="http://schemas.openxmlformats.org/wordprocessingml/2006/main" xmlns:w14="http://schemas.microsoft.com/office/word/2010/wordml" xmlns:w15="http://schemas.microsoft.com/office/word/2012/wordml" xmlns:w16cex="http://schemas.microsoft.com/office/word/2018/wordml/cex" xmlns:w16cid="http://schemas.microsoft.com/office/word/2016/wordml/cid" xmlns:w16="http://schemas.microsoft.com/office/word/2018/wordml" xmlns:w16du="http://schemas.microsoft.com/office/word/2023/wordml/word16du" xmlns:w16sdtdh="http://schemas.microsoft.com/office/word/2020/wordml/sdtdatahash" xmlns:w16sdtfl="http://schemas.microsoft.com/office/word/2024/wordml/sdtformatlock" xmlns:w16se="http://schemas.microsoft.com/office/word/2015/wordml/symex" xmlns:wpg="http://schemas.microsoft.com/office/word/2010/wordprocessingGroup" xmlns:wpi="http://schemas.microsoft.com/office/word/2010/wordprocessingInk" xmlns:wne="http://schemas.microsoft.com/office/word/2006/wordml" xmlns:wps="http://schemas.microsoft.com/office/word/2010/wordprocessingShape" mc:Ignorable="w14 w15 w16se w16cid w16 w16cex w16sdtdh w16sdtfl w16du wp14">
+<w:document xmlns:wpc="http://schemas.microsoft.com/office/word/2010/wordprocessingCanvas" xmlns:cx="http://schemas.microsoft.com/office/drawing/2014/chartex" xmlns:cx1="http://schemas.microsoft.com/office/drawing/2015/9/8/chartex" xmlns:cx2="http://schemas.microsoft.com/office/drawing/2015/10/21/chartex" xmlns:cx3="http://schemas.microsoft.com/office/drawing/2016/5/9/chartex" xmlns:cx4="http://schemas.microsoft.com/office/drawing/2016/5/10/chartex" xmlns:cx5="http://schemas.microsoft.com/office/drawing/2016/5/11/chartex" xmlns:cx6="http://schemas.microsoft.com/office/drawing/2016/5/12/chartex" xmlns:cx7="http://schemas.microsoft.com/office/drawing/2016/5/13/chartex" xmlns:cx8="http://schemas.microsoft.com/office/drawing/2016/5/14/chartex" xmlns:mc="http://schemas.openxmlformats.org/markup-compatibility/2006" xmlns:m="http://schemas.openxmlformats.org/officeDocument/2006/math" xmlns:aink="http://schemas.microsoft.com/office/drawing/2016/ink" xmlns:am3d="http://schemas.microsoft.com/office/drawing/2017/model3d" xmlns:oel="http://schemas.microsoft.com/office/2019/extlst" xmlns:r="http://schemas.openxmlformats.org/officeDocument/2006/relationships" xmlns:wp14="http://schemas.microsoft.com/office/word/2010/wordprocessingDrawing" xmlns:wp="http://schemas.openxmlformats.org/drawingml/2006/wordprocessingDrawing" xmlns:wpg="http://schemas.microsoft.com/office/word/2010/wordprocessingGroup" xmlns:wpi="http://schemas.microsoft.com/office/word/2010/wordprocessingInk" xmlns:wps="http://schemas.microsoft.com/office/word/2010/wordprocessingShape" xmlns:o="urn:schemas-microsoft-com:office:office" xmlns:v="urn:schemas-microsoft-com:vml" xmlns:w10="urn:schemas-microsoft-com:office:word" xmlns:w="http://schemas.openxmlformats.org/wordprocessingml/2006/main" xmlns:w14="http://schemas.microsoft.com/office/word/2010/wordml" xmlns:w15="http://schemas.microsoft.com/office/word/2012/wordml" xmlns:w16cex="http://schemas.microsoft.com/office/word/2018/wordml/cex" xmlns:w16cid="http://schemas.microsoft.com/office/word/2016/wordml/cid" xmlns:w16="http://schemas.microsoft.com/office/word/2018/wordml" xmlns:w16sdtdh="http://schemas.microsoft.com/office/word/2020/wordml/sdtdatahash" xmlns:w16sdtfl="http://schemas.microsoft.com/office/word/2024/wordml/sdtformatlock" xmlns:w16se="http://schemas.microsoft.com/office/word/2015/wordml/symex" xmlns:w16du="http://schemas.microsoft.com/office/word/2023/wordml/word16du" xmlns:wne="http://schemas.microsoft.com/office/word/2006/wordml" mc:Ignorable="w14 w15 w16se w16cid w16 w16cex w16sdtdh w16sdtfl w16du wp14">
   <w:body>
     <w:p>
       <w:pPr>
@@ -129,7 +129,7 @@
             <w:sz w:val="20"/>
             <w:szCs w:val="20"/>
           </w:rPr>
-          <w:t>https://github.com/prayaspatnaik21</w:t>
+          <w:t>https://prayaspatnaik21.github.io/</w:t>
         </w:r>
       </w:hyperlink>
     </w:p>
@@ -556,7 +556,23 @@
           <w:sz w:val="20"/>
           <w:szCs w:val="20"/>
         </w:rPr>
-        <w:t>Software Engineer (Automation Engineering Group) (Imaging Team)</w:t>
+        <w:t xml:space="preserve">Software Engineer </w:t>
+      </w:r>
+      <w:r>
+        <w:rPr>
+          <w:rFonts w:ascii="Calibri" w:eastAsia="Verdana" w:hAnsi="Calibri" w:cs="Calibri"/>
+          <w:sz w:val="20"/>
+          <w:szCs w:val="20"/>
+        </w:rPr>
+        <w:t xml:space="preserve">– Camera </w:t>
+      </w:r>
+      <w:r>
+        <w:rPr>
+          <w:rFonts w:ascii="Calibri" w:eastAsia="Verdana" w:hAnsi="Calibri" w:cs="Calibri"/>
+          <w:sz w:val="20"/>
+          <w:szCs w:val="20"/>
+        </w:rPr>
+        <w:t>Imaging Team</w:t>
       </w:r>
       <w:r>
         <w:rPr>
@@ -598,6 +614,14 @@
         </w:rPr>
         <w:tab/>
         <w:t xml:space="preserve">        </w:t>
+      </w:r>
+      <w:r>
+        <w:rPr>
+          <w:rFonts w:ascii="Calibri" w:eastAsia="Verdana" w:hAnsi="Calibri" w:cs="Calibri"/>
+          <w:sz w:val="20"/>
+          <w:szCs w:val="20"/>
+        </w:rPr>
+        <w:t xml:space="preserve">                                               </w:t>
       </w:r>
       <w:r>
         <w:rPr>
@@ -1328,6 +1352,136 @@
       <w:r>
         <w:rPr>
           <w:rFonts w:ascii="Calibri" w:eastAsia="Verdana" w:hAnsi="Calibri" w:cs="Calibri"/>
+          <w:sz w:val="20"/>
+          <w:szCs w:val="20"/>
+        </w:rPr>
+        <w:t xml:space="preserve">Developed an Integrating Sphere based </w:t>
+      </w:r>
+      <w:r>
+        <w:rPr>
+          <w:rFonts w:ascii="Calibri" w:eastAsia="Verdana" w:hAnsi="Calibri" w:cs="Calibri"/>
+          <w:b/>
+          <w:bCs/>
+          <w:sz w:val="20"/>
+          <w:szCs w:val="20"/>
+        </w:rPr>
+        <w:t>Lens Shading Correction (LSC)</w:t>
+      </w:r>
+      <w:r>
+        <w:rPr>
+          <w:rFonts w:ascii="Calibri" w:eastAsia="Verdana" w:hAnsi="Calibri" w:cs="Calibri"/>
+          <w:sz w:val="20"/>
+          <w:szCs w:val="20"/>
+        </w:rPr>
+        <w:t xml:space="preserve"> characterization workflow, capturing uniform flat field images and analyzing center to edge luminance and color channel falloff to evaluate camera shading performance.</w:t>
+      </w:r>
+    </w:p>
+    <w:p>
+      <w:pPr>
+        <w:pStyle w:val="ListParagraph"/>
+        <w:numPr>
+          <w:ilvl w:val="0"/>
+          <w:numId w:val="16"/>
+        </w:numPr>
+        <w:pBdr>
+          <w:top w:val="nil"/>
+          <w:left w:val="nil"/>
+          <w:bottom w:val="nil"/>
+          <w:right w:val="nil"/>
+          <w:between w:val="nil"/>
+        </w:pBdr>
+        <w:tabs>
+          <w:tab w:val="left" w:pos="2880"/>
+        </w:tabs>
+        <w:spacing w:before="120"/>
+        <w:rPr>
+          <w:rFonts w:ascii="Calibri" w:eastAsia="Verdana" w:hAnsi="Calibri" w:cs="Calibri"/>
+          <w:sz w:val="20"/>
+          <w:szCs w:val="20"/>
+        </w:rPr>
+      </w:pPr>
+      <w:r>
+        <w:rPr>
+          <w:rFonts w:ascii="Calibri" w:eastAsia="Verdana" w:hAnsi="Calibri" w:cs="Calibri"/>
+          <w:sz w:val="20"/>
+          <w:szCs w:val="20"/>
+        </w:rPr>
+        <w:t xml:space="preserve">Investigated </w:t>
+      </w:r>
+      <w:r>
+        <w:rPr>
+          <w:rFonts w:ascii="Calibri" w:eastAsia="Verdana" w:hAnsi="Calibri" w:cs="Calibri"/>
+          <w:b/>
+          <w:bCs/>
+          <w:sz w:val="20"/>
+          <w:szCs w:val="20"/>
+        </w:rPr>
+        <w:t>Ghosting</w:t>
+      </w:r>
+      <w:r>
+        <w:rPr>
+          <w:rFonts w:ascii="Calibri" w:eastAsia="Verdana" w:hAnsi="Calibri" w:cs="Calibri"/>
+          <w:sz w:val="20"/>
+          <w:szCs w:val="20"/>
+        </w:rPr>
+        <w:t xml:space="preserve"> </w:t>
+      </w:r>
+      <w:r>
+        <w:rPr>
+          <w:rFonts w:ascii="Calibri" w:eastAsia="Verdana" w:hAnsi="Calibri" w:cs="Calibri"/>
+          <w:b/>
+          <w:bCs/>
+          <w:sz w:val="20"/>
+          <w:szCs w:val="20"/>
+        </w:rPr>
+        <w:t>A</w:t>
+      </w:r>
+      <w:r>
+        <w:rPr>
+          <w:rFonts w:ascii="Calibri" w:eastAsia="Verdana" w:hAnsi="Calibri" w:cs="Calibri"/>
+          <w:b/>
+          <w:bCs/>
+          <w:sz w:val="20"/>
+          <w:szCs w:val="20"/>
+        </w:rPr>
+        <w:t xml:space="preserve">rtifacts </w:t>
+      </w:r>
+      <w:r>
+        <w:rPr>
+          <w:rFonts w:ascii="Calibri" w:eastAsia="Verdana" w:hAnsi="Calibri" w:cs="Calibri"/>
+          <w:sz w:val="20"/>
+          <w:szCs w:val="20"/>
+        </w:rPr>
+        <w:t>in VD6763 based camera applications and designed characterization experiments to evaluate sensor/imaging parameters, establishing mitigation guidelines and recommended configurations for improve image quality.</w:t>
+      </w:r>
+    </w:p>
+    <w:p>
+      <w:pPr>
+        <w:pStyle w:val="ListParagraph"/>
+        <w:numPr>
+          <w:ilvl w:val="0"/>
+          <w:numId w:val="16"/>
+        </w:numPr>
+        <w:pBdr>
+          <w:top w:val="nil"/>
+          <w:left w:val="nil"/>
+          <w:bottom w:val="nil"/>
+          <w:right w:val="nil"/>
+          <w:between w:val="nil"/>
+        </w:pBdr>
+        <w:tabs>
+          <w:tab w:val="left" w:pos="2880"/>
+        </w:tabs>
+        <w:spacing w:before="120"/>
+        <w:rPr>
+          <w:rFonts w:ascii="Calibri" w:eastAsia="Verdana" w:hAnsi="Calibri" w:cs="Calibri"/>
+          <w:sz w:val="20"/>
+          <w:szCs w:val="20"/>
+        </w:rPr>
+      </w:pPr>
+      <w:r>
+        <w:rPr>
+          <w:rFonts w:ascii="Calibri" w:eastAsia="Verdana" w:hAnsi="Calibri" w:cs="Calibri"/>
           <w:b/>
           <w:bCs/>
           <w:sz w:val="20"/>
@@ -1358,6 +1512,97 @@
           <w:szCs w:val="20"/>
         </w:rPr>
         <w:t xml:space="preserve"> and incorrect gain clipping in Reinhard Tone Mapping.</w:t>
+      </w:r>
+    </w:p>
+    <w:p>
+      <w:pPr>
+        <w:pStyle w:val="ListParagraph"/>
+        <w:numPr>
+          <w:ilvl w:val="0"/>
+          <w:numId w:val="16"/>
+        </w:numPr>
+        <w:pBdr>
+          <w:top w:val="nil"/>
+          <w:left w:val="nil"/>
+          <w:bottom w:val="nil"/>
+          <w:right w:val="nil"/>
+          <w:between w:val="nil"/>
+        </w:pBdr>
+        <w:tabs>
+          <w:tab w:val="left" w:pos="2880"/>
+        </w:tabs>
+        <w:spacing w:before="120"/>
+        <w:rPr>
+          <w:rFonts w:asciiTheme="minorHAnsi" w:eastAsia="Verdana" w:hAnsiTheme="minorHAnsi" w:cstheme="minorHAnsi"/>
+          <w:sz w:val="20"/>
+          <w:szCs w:val="20"/>
+        </w:rPr>
+      </w:pPr>
+      <w:r>
+        <w:rPr>
+          <w:rFonts w:asciiTheme="minorHAnsi" w:hAnsiTheme="minorHAnsi" w:cstheme="minorHAnsi"/>
+          <w:sz w:val="20"/>
+          <w:szCs w:val="20"/>
+        </w:rPr>
+        <w:t xml:space="preserve">Developed an automatic alpha estimation method for </w:t>
+      </w:r>
+      <w:r>
+        <w:rPr>
+          <w:rFonts w:asciiTheme="minorHAnsi" w:hAnsiTheme="minorHAnsi" w:cstheme="minorHAnsi"/>
+          <w:b/>
+          <w:bCs/>
+          <w:sz w:val="20"/>
+          <w:szCs w:val="20"/>
+        </w:rPr>
+        <w:t xml:space="preserve">Reinhard </w:t>
+      </w:r>
+      <w:r>
+        <w:rPr>
+          <w:rFonts w:asciiTheme="minorHAnsi" w:hAnsiTheme="minorHAnsi" w:cstheme="minorHAnsi"/>
+          <w:b/>
+          <w:bCs/>
+          <w:sz w:val="20"/>
+          <w:szCs w:val="20"/>
+        </w:rPr>
+        <w:t>T</w:t>
+      </w:r>
+      <w:r>
+        <w:rPr>
+          <w:rFonts w:asciiTheme="minorHAnsi" w:hAnsiTheme="minorHAnsi" w:cstheme="minorHAnsi"/>
+          <w:b/>
+          <w:bCs/>
+          <w:sz w:val="20"/>
+          <w:szCs w:val="20"/>
+        </w:rPr>
+        <w:t xml:space="preserve">one </w:t>
+      </w:r>
+      <w:r>
+        <w:rPr>
+          <w:rFonts w:asciiTheme="minorHAnsi" w:hAnsiTheme="minorHAnsi" w:cstheme="minorHAnsi"/>
+          <w:b/>
+          <w:bCs/>
+          <w:sz w:val="20"/>
+          <w:szCs w:val="20"/>
+        </w:rPr>
+        <w:t>M</w:t>
+      </w:r>
+      <w:r>
+        <w:rPr>
+          <w:rFonts w:asciiTheme="minorHAnsi" w:hAnsiTheme="minorHAnsi" w:cstheme="minorHAnsi"/>
+          <w:b/>
+          <w:bCs/>
+          <w:sz w:val="20"/>
+          <w:szCs w:val="20"/>
+        </w:rPr>
+        <w:t>apping</w:t>
+      </w:r>
+      <w:r>
+        <w:rPr>
+          <w:rFonts w:asciiTheme="minorHAnsi" w:hAnsiTheme="minorHAnsi" w:cstheme="minorHAnsi"/>
+          <w:sz w:val="20"/>
+          <w:szCs w:val="20"/>
+        </w:rPr>
+        <w:t xml:space="preserve"> by extending the existing parametric estimation formulation.</w:t>
       </w:r>
     </w:p>
     <w:p>
@@ -3300,188 +3545,6 @@
         <w:t>Jenkins.</w:t>
       </w:r>
     </w:p>
-    <w:p>
-      <w:pPr>
-        <w:pBdr>
-          <w:bottom w:val="single" w:sz="4" w:space="1" w:color="000000"/>
-        </w:pBdr>
-        <w:spacing w:before="120"/>
-        <w:rPr>
-          <w:rFonts w:ascii="Calibri" w:eastAsia="Verdana" w:hAnsi="Calibri" w:cs="Calibri"/>
-          <w:b/>
-          <w:bCs/>
-          <w:sz w:val="25"/>
-          <w:szCs w:val="25"/>
-        </w:rPr>
-      </w:pPr>
-      <w:r>
-        <w:rPr>
-          <w:rFonts w:ascii="Calibri" w:eastAsia="Verdana" w:hAnsi="Calibri" w:cs="Calibri"/>
-          <w:b/>
-          <w:bCs/>
-          <w:sz w:val="25"/>
-          <w:szCs w:val="25"/>
-        </w:rPr>
-        <w:t>PROJECTS</w:t>
-      </w:r>
-    </w:p>
-    <w:p>
-      <w:pPr>
-        <w:spacing w:before="120"/>
-        <w:rPr>
-          <w:rFonts w:ascii="Calibri" w:eastAsia="Verdana" w:hAnsi="Calibri" w:cs="Calibri"/>
-          <w:b/>
-          <w:bCs/>
-          <w:color w:val="000000"/>
-          <w:sz w:val="20"/>
-          <w:szCs w:val="20"/>
-        </w:rPr>
-      </w:pPr>
-      <w:r>
-        <w:rPr>
-          <w:rFonts w:ascii="Calibri" w:eastAsia="Verdana" w:hAnsi="Calibri" w:cs="Calibri"/>
-          <w:b/>
-          <w:bCs/>
-          <w:color w:val="000000"/>
-          <w:sz w:val="20"/>
-          <w:szCs w:val="20"/>
-        </w:rPr>
-        <w:t>Computational Time Analysis of Dense Matrix Operations on CPU and GPU (Tools: OpenGL, OpenCV)</w:t>
-      </w:r>
-    </w:p>
-    <w:p>
-      <w:pPr>
-        <w:pStyle w:val="ListParagraph"/>
-        <w:numPr>
-          <w:ilvl w:val="0"/>
-          <w:numId w:val="15"/>
-        </w:numPr>
-        <w:jc w:val="both"/>
-        <w:rPr>
-          <w:rFonts w:ascii="Calibri" w:eastAsia="Verdana" w:hAnsi="Calibri" w:cs="Calibri"/>
-          <w:color w:val="000000"/>
-          <w:sz w:val="20"/>
-          <w:szCs w:val="20"/>
-        </w:rPr>
-      </w:pPr>
-      <w:r>
-        <w:rPr>
-          <w:rFonts w:ascii="Calibri" w:eastAsia="Verdana" w:hAnsi="Calibri" w:cs="Calibri"/>
-          <w:color w:val="000000"/>
-          <w:sz w:val="20"/>
-          <w:szCs w:val="20"/>
-        </w:rPr>
-        <w:t xml:space="preserve">Evaluated the execution time of Image Operation (Grey Scale </w:t>
-      </w:r>
-      <w:r>
-        <w:rPr>
-          <w:rFonts w:ascii="Calibri" w:eastAsia="Verdana" w:hAnsi="Calibri" w:cs="Calibri"/>
-          <w:color w:val="000000"/>
-          <w:sz w:val="20"/>
-          <w:szCs w:val="20"/>
-        </w:rPr>
-        <w:t>Conversion,</w:t>
-      </w:r>
-      <w:r>
-        <w:rPr>
-          <w:rFonts w:ascii="Calibri" w:eastAsia="Verdana" w:hAnsi="Calibri" w:cs="Calibri"/>
-          <w:color w:val="000000"/>
-          <w:sz w:val="20"/>
-          <w:szCs w:val="20"/>
-        </w:rPr>
-        <w:t xml:space="preserve"> </w:t>
-      </w:r>
-      <w:r>
-        <w:rPr>
-          <w:rFonts w:ascii="Calibri" w:eastAsia="Verdana" w:hAnsi="Calibri" w:cs="Calibri"/>
-          <w:color w:val="000000"/>
-          <w:sz w:val="20"/>
-          <w:szCs w:val="20"/>
-        </w:rPr>
-        <w:t>Translation,</w:t>
-      </w:r>
-      <w:r>
-        <w:rPr>
-          <w:rFonts w:ascii="Calibri" w:eastAsia="Verdana" w:hAnsi="Calibri" w:cs="Calibri"/>
-          <w:color w:val="000000"/>
-          <w:sz w:val="20"/>
-          <w:szCs w:val="20"/>
-        </w:rPr>
-        <w:t xml:space="preserve"> </w:t>
-      </w:r>
-      <w:r>
-        <w:rPr>
-          <w:rFonts w:ascii="Calibri" w:eastAsia="Verdana" w:hAnsi="Calibri" w:cs="Calibri"/>
-          <w:color w:val="000000"/>
-          <w:sz w:val="20"/>
-          <w:szCs w:val="20"/>
-        </w:rPr>
-        <w:t>Filter (</w:t>
-      </w:r>
-      <w:r>
-        <w:rPr>
-          <w:rFonts w:ascii="Calibri" w:eastAsia="Verdana" w:hAnsi="Calibri" w:cs="Calibri"/>
-          <w:color w:val="000000"/>
-          <w:sz w:val="20"/>
-          <w:szCs w:val="20"/>
-        </w:rPr>
-        <w:t xml:space="preserve">Gaussian), Rotation) of different Image Resolutions on </w:t>
-      </w:r>
-      <w:r>
-        <w:rPr>
-          <w:rFonts w:ascii="Calibri" w:eastAsia="Verdana" w:hAnsi="Calibri" w:cs="Calibri"/>
-          <w:b/>
-          <w:bCs/>
-          <w:color w:val="000000"/>
-          <w:sz w:val="20"/>
-          <w:szCs w:val="20"/>
-        </w:rPr>
-        <w:t>CPU and GPU</w:t>
-      </w:r>
-      <w:r>
-        <w:rPr>
-          <w:rFonts w:ascii="Calibri" w:eastAsia="Verdana" w:hAnsi="Calibri" w:cs="Calibri"/>
-          <w:color w:val="000000"/>
-          <w:sz w:val="20"/>
-          <w:szCs w:val="20"/>
-        </w:rPr>
-        <w:t>.</w:t>
-      </w:r>
-      <w:r>
-        <w:rPr>
-          <w:rFonts w:ascii="Calibri" w:eastAsia="Verdana" w:hAnsi="Calibri" w:cs="Calibri"/>
-          <w:color w:val="000000"/>
-          <w:sz w:val="20"/>
-          <w:szCs w:val="20"/>
-        </w:rPr>
-        <w:t xml:space="preserve"> </w:t>
-      </w:r>
-    </w:p>
-    <w:p>
-      <w:pPr>
-        <w:pStyle w:val="ListParagraph"/>
-        <w:numPr>
-          <w:ilvl w:val="0"/>
-          <w:numId w:val="15"/>
-        </w:numPr>
-        <w:jc w:val="both"/>
-        <w:rPr>
-          <w:rFonts w:ascii="Calibri" w:eastAsia="Verdana" w:hAnsi="Calibri" w:cs="Calibri"/>
-          <w:color w:val="000000"/>
-          <w:sz w:val="20"/>
-          <w:szCs w:val="20"/>
-        </w:rPr>
-      </w:pPr>
-      <w:r>
-        <w:rPr>
-          <w:rFonts w:ascii="Calibri" w:eastAsia="Verdana" w:hAnsi="Calibri" w:cs="Calibri"/>
-          <w:color w:val="000000"/>
-          <w:sz w:val="20"/>
-          <w:szCs w:val="20"/>
-        </w:rPr>
-        <w:t>Operations on GPU were 43%(Average) faster as compared to CPU.</w:t>
-      </w:r>
-    </w:p>
     <w:sectPr>
       <w:pgSz w:w="12240" w:h="15840"/>
       <w:pgMar w:top="720" w:right="720" w:bottom="720" w:left="720" w:header="0" w:footer="0" w:gutter="0"/>
@@ -3494,7 +3557,7 @@
 </file>
 
 <file path=word/numbering.xml><?xml version="1.0" encoding="utf-8"?>
-<w:numbering xmlns:wpc="http://schemas.microsoft.com/office/word/2010/wordprocessingCanvas" xmlns:cx="http://schemas.microsoft.com/office/drawing/2014/chartex" xmlns:cx1="http://schemas.microsoft.com/office/drawing/2015/9/8/chartex" xmlns:cx2="http://schemas.microsoft.com/office/drawing/2015/10/21/chartex" xmlns:cx3="http://schemas.microsoft.com/office/drawing/2016/5/9/chartex" xmlns:cx4="http://schemas.microsoft.com/office/drawing/2016/5/10/chartex" xmlns:cx5="http://schemas.microsoft.com/office/drawing/2016/5/11/chartex" xmlns:cx6="http://schemas.microsoft.com/office/drawing/2016/5/12/chartex" xmlns:cx7="http://schemas.microsoft.com/office/drawing/2016/5/13/chartex" xmlns:cx8="http://schemas.microsoft.com/office/drawing/2016/5/14/chartex" xmlns:mc="http://schemas.openxmlformats.org/markup-compatibility/2006" xmlns:aink="http://schemas.microsoft.com/office/drawing/2016/ink" xmlns:am3d="http://schemas.microsoft.com/office/drawing/2017/model3d" xmlns:o="urn:schemas-microsoft-com:office:office" xmlns:oel="http://schemas.microsoft.com/office/2019/extlst" xmlns:r="http://schemas.openxmlformats.org/officeDocument/2006/relationships" xmlns:m="http://schemas.openxmlformats.org/officeDocument/2006/math" xmlns:v="urn:schemas-microsoft-com:vml" xmlns:wp14="http://schemas.microsoft.com/office/word/2010/wordprocessingDrawing" xmlns:wp="http://schemas.openxmlformats.org/drawingml/2006/wordprocessingDrawing" xmlns:w10="urn:schemas-microsoft-com:office:word" xmlns:w="http://schemas.openxmlformats.org/wordprocessingml/2006/main" xmlns:w14="http://schemas.microsoft.com/office/word/2010/wordml" xmlns:w15="http://schemas.microsoft.com/office/word/2012/wordml" xmlns:w16cex="http://schemas.microsoft.com/office/word/2018/wordml/cex" xmlns:w16cid="http://schemas.microsoft.com/office/word/2016/wordml/cid" xmlns:w16="http://schemas.microsoft.com/office/word/2018/wordml" xmlns:w16du="http://schemas.microsoft.com/office/word/2023/wordml/word16du" xmlns:w16sdtdh="http://schemas.microsoft.com/office/word/2020/wordml/sdtdatahash" xmlns:w16sdtfl="http://schemas.microsoft.com/office/word/2024/wordml/sdtformatlock" xmlns:w16se="http://schemas.microsoft.com/office/word/2015/wordml/symex" xmlns:wpg="http://schemas.microsoft.com/office/word/2010/wordprocessingGroup" xmlns:wpi="http://schemas.microsoft.com/office/word/2010/wordprocessingInk" xmlns:wne="http://schemas.microsoft.com/office/word/2006/wordml" xmlns:wps="http://schemas.microsoft.com/office/word/2010/wordprocessingShape" mc:Ignorable="w14 w15 w16se w16cid w16 w16cex w16sdtdh w16sdtfl w16du wp14">
+<w:numbering xmlns:wpc="http://schemas.microsoft.com/office/word/2010/wordprocessingCanvas" xmlns:cx="http://schemas.microsoft.com/office/drawing/2014/chartex" xmlns:cx1="http://schemas.microsoft.com/office/drawing/2015/9/8/chartex" xmlns:cx2="http://schemas.microsoft.com/office/drawing/2015/10/21/chartex" xmlns:cx3="http://schemas.microsoft.com/office/drawing/2016/5/9/chartex" xmlns:cx4="http://schemas.microsoft.com/office/drawing/2016/5/10/chartex" xmlns:cx5="http://schemas.microsoft.com/office/drawing/2016/5/11/chartex" xmlns:cx6="http://schemas.microsoft.com/office/drawing/2016/5/12/chartex" xmlns:cx7="http://schemas.microsoft.com/office/drawing/2016/5/13/chartex" xmlns:cx8="http://schemas.microsoft.com/office/drawing/2016/5/14/chartex" xmlns:mc="http://schemas.openxmlformats.org/markup-compatibility/2006" xmlns:m="http://schemas.openxmlformats.org/officeDocument/2006/math" xmlns:aink="http://schemas.microsoft.com/office/drawing/2016/ink" xmlns:am3d="http://schemas.microsoft.com/office/drawing/2017/model3d" xmlns:oel="http://schemas.microsoft.com/office/2019/extlst" xmlns:r="http://schemas.openxmlformats.org/officeDocument/2006/relationships" xmlns:wp14="http://schemas.microsoft.com/office/word/2010/wordprocessingDrawing" xmlns:wp="http://schemas.openxmlformats.org/drawingml/2006/wordprocessingDrawing" xmlns:wpg="http://schemas.microsoft.com/office/word/2010/wordprocessingGroup" xmlns:wpi="http://schemas.microsoft.com/office/word/2010/wordprocessingInk" xmlns:wps="http://schemas.microsoft.com/office/word/2010/wordprocessingShape" xmlns:o="urn:schemas-microsoft-com:office:office" xmlns:v="urn:schemas-microsoft-com:vml" xmlns:w10="urn:schemas-microsoft-com:office:word" xmlns:w="http://schemas.openxmlformats.org/wordprocessingml/2006/main" xmlns:w14="http://schemas.microsoft.com/office/word/2010/wordml" xmlns:w15="http://schemas.microsoft.com/office/word/2012/wordml" xmlns:w16cex="http://schemas.microsoft.com/office/word/2018/wordml/cex" xmlns:w16cid="http://schemas.microsoft.com/office/word/2016/wordml/cid" xmlns:w16="http://schemas.microsoft.com/office/word/2018/wordml" xmlns:w16sdtdh="http://schemas.microsoft.com/office/word/2020/wordml/sdtdatahash" xmlns:w16sdtfl="http://schemas.microsoft.com/office/word/2024/wordml/sdtformatlock" xmlns:w16se="http://schemas.microsoft.com/office/word/2015/wordml/symex" xmlns:w16du="http://schemas.microsoft.com/office/word/2023/wordml/word16du" xmlns:wne="http://schemas.microsoft.com/office/word/2006/wordml" mc:Ignorable="w14 w15 w16se w16cid w16 w16cex w16sdtdh w16sdtfl w16du wp14">
   <w:abstractNum w:abstractNumId="0" w15:restartNumberingAfterBreak="0">
     <w:nsid w:val="03C01EF7"/>
     <w:multiLevelType w:val="hybridMultilevel"/>
@@ -5328,7 +5391,7 @@
 </file>
 
 <file path=word/styles.xml><?xml version="1.0" encoding="utf-8"?>
-<w:styles xmlns:mc="http://schemas.openxmlformats.org/markup-compatibility/2006" xmlns:r="http://schemas.openxmlformats.org/officeDocument/2006/relationships" xmlns:w="http://schemas.openxmlformats.org/wordprocessingml/2006/main" xmlns:w14="http://schemas.microsoft.com/office/word/2010/wordml" xmlns:w15="http://schemas.microsoft.com/office/word/2012/wordml" xmlns:w16cex="http://schemas.microsoft.com/office/word/2018/wordml/cex" xmlns:w16cid="http://schemas.microsoft.com/office/word/2016/wordml/cid" xmlns:w16="http://schemas.microsoft.com/office/word/2018/wordml" xmlns:w16du="http://schemas.microsoft.com/office/word/2023/wordml/word16du" xmlns:w16sdtdh="http://schemas.microsoft.com/office/word/2020/wordml/sdtdatahash" xmlns:w16sdtfl="http://schemas.microsoft.com/office/word/2024/wordml/sdtformatlock" xmlns:w16se="http://schemas.microsoft.com/office/word/2015/wordml/symex" mc:Ignorable="w14 w15 w16se w16cid w16 w16cex w16sdtdh w16sdtfl w16du">
+<w:styles xmlns:mc="http://schemas.openxmlformats.org/markup-compatibility/2006" xmlns:r="http://schemas.openxmlformats.org/officeDocument/2006/relationships" xmlns:w="http://schemas.openxmlformats.org/wordprocessingml/2006/main" xmlns:w14="http://schemas.microsoft.com/office/word/2010/wordml" xmlns:w15="http://schemas.microsoft.com/office/word/2012/wordml" xmlns:w16cex="http://schemas.microsoft.com/office/word/2018/wordml/cex" xmlns:w16cid="http://schemas.microsoft.com/office/word/2016/wordml/cid" xmlns:w16="http://schemas.microsoft.com/office/word/2018/wordml" xmlns:w16sdtdh="http://schemas.microsoft.com/office/word/2020/wordml/sdtdatahash" xmlns:w16sdtfl="http://schemas.microsoft.com/office/word/2024/wordml/sdtformatlock" xmlns:w16se="http://schemas.microsoft.com/office/word/2015/wordml/symex" xmlns:w16du="http://schemas.microsoft.com/office/word/2023/wordml/word16du" mc:Ignorable="w14 w15 w16se w16cid w16 w16cex w16sdtdh w16sdtfl w16du">
   <w:docDefaults>
     <w:rPrDefault>
       <w:rPr>

</xml_diff>